<commit_message>
setup: use the bundled extracted stack offline; docs accuracy pass
Deep review of Setup-MoodleNative.ps1 found it always downloaded and required the PHP/Apache/MariaDB/Moodle archives even though the extracted binaries ship in the repo, and -Reinstall re-extracted them - so a fresh clone still needed internet and the Cloudflare-blocked Apache Lounge download. Fixed: detect the bundled binaries (native/stack/php|Apache24|mariadb|moodle) and skip their download, archive check and extraction unless missing or -RefreshBinaries is given; -Reinstall now rebuilds only the database, config.php and moodledata. A fresh clone + .env + -Reinstall now installs with no internet for the server tier (only the VC++ runtime, if absent). README + docs: added the no-spaces-in-path requirement (cron task + service binPath), the VC++-only internet note, and -RefreshBinaries.
</commit_message>
<xml_diff>
--- a/docs/ITM-GOI-Examination-Portal.docx
+++ b/docs/ITM-GOI-Examination-Portal.docx
@@ -1014,7 +1014,16 @@
     </w:p>
     <w:p>
       <w:r>
-        <w:t xml:space="preserve">The platform is a self-contained folder. Everything it needs — PHP, Apache, MariaDB and Moodle — travels inside the repository, so setup is a </w:t>
+        <w:t xml:space="preserve">The platform is a self-contained folder. Everything it needs — PHP, Apache, MariaDB and Moodle — ships </w:t>
+      </w:r>
+      <w:r>
+        <w:rPr>
+          <w:b/>
+        </w:rPr>
+        <w:t>extracted</w:t>
+      </w:r>
+      <w:r>
+        <w:t xml:space="preserve"> inside the repository, so setup is a </w:t>
       </w:r>
       <w:r>
         <w:rPr>
@@ -1025,7 +1034,7 @@
         <w:t>git clone</w:t>
       </w:r>
       <w:r>
-        <w:t xml:space="preserve"> plus one script. There is no Docker, no separate installers, and no download step during setup. The script derives every path from the folder it sits in, so the project can live on any drive or directory.</w:t>
+        <w:t xml:space="preserve"> plus one script. There is no Docker and no separate installers. The server tier needs no internet during setup — only the Visual C++ 2015–2022 x64 runtime is fetched, and only if it is not already installed. The script derives every path from the folder it sits in, so the project can live on any drive.</w:t>
       </w:r>
     </w:p>
     <w:p>
@@ -1165,7 +1174,7 @@
           <w:color w:val="241A1C"/>
           <w:sz w:val="18"/>
         </w:rPr>
-        <w:t>git clone https://github.com/Neerajparashar1/ASSESMENT.git</w:t>
+        <w:t>git clone https://github.com/Neerajparashar1/ASSESMENT.git C:\exam\ASSESMENT</w:t>
       </w:r>
       <w:r>
         <w:br/>
@@ -1176,43 +1185,28 @@
           <w:color w:val="241A1C"/>
           <w:sz w:val="18"/>
         </w:rPr>
-        <w:t>cd ASSESMENT</w:t>
+        <w:t>cd C:\exam\ASSESMENT</w:t>
       </w:r>
     </w:p>
     <w:p>
-      <w:r>
-        <w:t xml:space="preserve">It can be cloned anywhere — </w:t>
-      </w:r>
+      <w:pPr>
+        <w:spacing w:before="80" w:after="160"/>
+        <w:ind w:left="173"/>
+        <w:shd w:val="clear" w:color="auto" w:fill="F7EEF0"/>
+      </w:pPr>
       <w:r>
         <w:rPr>
-          <w:rFonts w:ascii="Consolas" w:hAnsi="Consolas"/>
+          <w:b/>
           <w:color w:val="8A1B2C"/>
           <w:sz w:val="19"/>
         </w:rPr>
-        <w:t>C:\exam</w:t>
-      </w:r>
-      <w:r>
-        <w:t xml:space="preserve">, </w:t>
+        <w:t xml:space="preserve">The project path must contain no spaces — </w:t>
       </w:r>
       <w:r>
         <w:rPr>
-          <w:rFonts w:ascii="Consolas" w:hAnsi="Consolas"/>
-          <w:color w:val="8A1B2C"/>
           <w:sz w:val="19"/>
         </w:rPr>
-        <w:t>D:\ASSESMENT</w:t>
-      </w:r>
-      <w:r>
-        <w:t xml:space="preserve">, an external drive. </w:t>
-      </w:r>
-      <w:r>
-        <w:rPr>
-          <w:b/>
-        </w:rPr>
-        <w:t>Avoid</w:t>
-      </w:r>
-      <w:r>
-        <w:t xml:space="preserve"> a OneDrive-synced folder or a very deep path; file-locking and the 260-character path limit cause confusing failures. A short path such as </w:t>
+        <w:t xml:space="preserve">and should be short and not OneDrive-synced. </w:t>
       </w:r>
       <w:r>
         <w:rPr>
@@ -1223,7 +1217,24 @@
         <w:t>C:\exam\ASSESMENT</w:t>
       </w:r>
       <w:r>
-        <w:t xml:space="preserve"> is safest.</w:t>
+        <w:rPr>
+          <w:sz w:val="19"/>
+        </w:rPr>
+        <w:t xml:space="preserve"> is fine; </w:t>
+      </w:r>
+      <w:r>
+        <w:rPr>
+          <w:rFonts w:ascii="Consolas" w:hAnsi="Consolas"/>
+          <w:color w:val="8A1B2C"/>
+          <w:sz w:val="19"/>
+        </w:rPr>
+        <w:t>C:\Users\John Doe\...</w:t>
+      </w:r>
+      <w:r>
+        <w:rPr>
+          <w:sz w:val="19"/>
+        </w:rPr>
+        <w:t xml:space="preserve"> is not — the cron-task registration and the Windows service paths do not survive a space. Deep paths also hit the 260-character limit; OneDrive folders cause file-lock failures.</w:t>
       </w:r>
     </w:p>
     <w:p>
@@ -2068,7 +2079,7 @@
         <w:pStyle w:val="ListNumber"/>
       </w:pPr>
       <w:r>
-        <w:t>Installs the Visual C++ 2015–2022 runtime if it is missing.</w:t>
+        <w:t>Installs the Visual C++ 2015–2022 runtime if it is missing (the one step that may need internet).</w:t>
       </w:r>
     </w:p>
     <w:p>
@@ -2076,7 +2087,29 @@
         <w:pStyle w:val="ListNumber"/>
       </w:pPr>
       <w:r>
-        <w:t>Verifies the bundled PHP 8.3, Apache 2.4, MariaDB 11.4 and Moodle 4.5 are present (they ship in the repo; it only downloads if one is missing).</w:t>
+        <w:t xml:space="preserve">Detects the bundled PHP 8.3, Apache 2.4, MariaDB 11.4 and Moodle 4.5 under </w:t>
+      </w:r>
+      <w:r>
+        <w:rPr>
+          <w:rFonts w:ascii="Consolas" w:hAnsi="Consolas"/>
+          <w:color w:val="8A1B2C"/>
+          <w:sz w:val="19"/>
+        </w:rPr>
+        <w:t>native\stack\</w:t>
+      </w:r>
+      <w:r>
+        <w:t xml:space="preserve"> and uses them as-is — it downloads a component only if it is genuinely missing (or you pass </w:t>
+      </w:r>
+      <w:r>
+        <w:rPr>
+          <w:rFonts w:ascii="Consolas" w:hAnsi="Consolas"/>
+          <w:color w:val="8A1B2C"/>
+          <w:sz w:val="19"/>
+        </w:rPr>
+        <w:t>-RefreshBinaries</w:t>
+      </w:r>
+      <w:r>
+        <w:t>).</w:t>
       </w:r>
     </w:p>
     <w:p>
@@ -3023,6 +3056,22 @@
       </w:r>
       <w:r>
         <w:t xml:space="preserve"> — use PHP 8.2 instead of 8.3.</w:t>
+      </w:r>
+    </w:p>
+    <w:p>
+      <w:pPr>
+        <w:pStyle w:val="ListBullet"/>
+      </w:pPr>
+      <w:r>
+        <w:rPr>
+          <w:rFonts w:ascii="Consolas" w:hAnsi="Consolas"/>
+          <w:color w:val="8A1B2C"/>
+          <w:sz w:val="19"/>
+        </w:rPr>
+        <w:t>-RefreshBinaries</w:t>
+      </w:r>
+      <w:r>
+        <w:t xml:space="preserve"> — force a clean re-download and re-extract of PHP / Apache / MariaDB / Moodle (normally the bundled copies are used as-is).</w:t>
       </w:r>
     </w:p>
     <w:p>

</xml_diff>